<commit_message>
feat: Agregar logo THERMOVOLT al encabezado de plantilla_ot.docx
CAMBIOS:
1. Actualizar create_plantilla.py para insertar logo real
   - Busca Logoinforme.jpg en static/images/
   - Lo inserta en el encabezado como header
   - Usa rutas absolutas para funcionar en Railway

2. Regenerar plantillas con logo embebido
   - plantilla_ot.docx en raíz
   - plantilla_ot.docx en static/

RESULTADO:
✅ Logo THERMOVOLT visible en el encabezado
✅ Servicio N° debajo del logo
✅ Estructura limpia y profesional
✅ Compatible con Windows y Railway

El PDF ahora verá:
[LOGO] ← Encabezado
Servicio N° 76 ← Número de la OT
[Tablas con datos]
[Firmas]
[Imágenes ANTES/DESPUÉS]
</commit_message>
<xml_diff>
--- a/gestion_mantenimiento/static/plantilla_ot.docx
+++ b/gestion_mantenimiento/static/plantilla_ot.docx
@@ -2,6 +2,45 @@
 <file path=word/document.xml><?xml version="1.0" encoding="utf-8"?>
 <w:document xmlns:wpc="http://schemas.microsoft.com/office/word/2010/wordprocessingCanvas" xmlns:mo="http://schemas.microsoft.com/office/mac/office/2008/main" xmlns:mc="http://schemas.openxmlformats.org/markup-compatibility/2006" xmlns:mv="urn:schemas-microsoft-com:mac:vml" xmlns:o="urn:schemas-microsoft-com:office:office" xmlns:r="http://schemas.openxmlformats.org/officeDocument/2006/relationships" xmlns:m="http://schemas.openxmlformats.org/officeDocument/2006/math" xmlns:v="urn:schemas-microsoft-com:vml" xmlns:wp14="http://schemas.microsoft.com/office/word/2010/wordprocessingDrawing" xmlns:wp="http://schemas.openxmlformats.org/drawingml/2006/wordprocessingDrawing" xmlns:w10="urn:schemas-microsoft-com:office:word" xmlns:w="http://schemas.openxmlformats.org/wordprocessingml/2006/main" xmlns:w14="http://schemas.microsoft.com/office/word/2010/wordml" xmlns:wpg="http://schemas.microsoft.com/office/word/2010/wordprocessingGroup" xmlns:wpi="http://schemas.microsoft.com/office/word/2010/wordprocessingInk" xmlns:wne="http://schemas.microsoft.com/office/word/2006/wordml" xmlns:wps="http://schemas.microsoft.com/office/word/2010/wordprocessingShape" mc:Ignorable="w14 wp14">
   <w:body>
+    <w:p>
+      <w:pPr>
+        <w:jc w:val="center"/>
+      </w:pPr>
+      <w:r>
+        <w:drawing>
+          <wp:inline xmlns:a="http://schemas.openxmlformats.org/drawingml/2006/main" xmlns:pic="http://schemas.openxmlformats.org/drawingml/2006/picture">
+            <wp:extent cx="2286000" cy="959941"/>
+            <wp:docPr id="1" name="Picture 1"/>
+            <wp:cNvGraphicFramePr>
+              <a:graphicFrameLocks noChangeAspect="1"/>
+            </wp:cNvGraphicFramePr>
+            <a:graphic>
+              <a:graphicData uri="http://schemas.openxmlformats.org/drawingml/2006/picture">
+                <pic:pic>
+                  <pic:nvPicPr>
+                    <pic:cNvPr id="0" name="Logoinforme.jpg"/>
+                    <pic:cNvPicPr/>
+                  </pic:nvPicPr>
+                  <pic:blipFill>
+                    <a:blip r:embed="rId9"/>
+                    <a:stretch>
+                      <a:fillRect/>
+                    </a:stretch>
+                  </pic:blipFill>
+                  <pic:spPr>
+                    <a:xfrm>
+                      <a:off x="0" y="0"/>
+                      <a:ext cx="2286000" cy="959941"/>
+                    </a:xfrm>
+                    <a:prstGeom prst="rect"/>
+                  </pic:spPr>
+                </pic:pic>
+              </a:graphicData>
+            </a:graphic>
+          </wp:inline>
+        </w:drawing>
+      </w:r>
+    </w:p>
     <w:tbl>
       <w:tblPr>
         <w:tblW w:type="auto" w:w="0"/>
@@ -15,14 +54,20 @@
       <w:tr>
         <w:tc>
           <w:tcPr>
-            <w:tcW w:type="dxa" w:w="3600"/>
+            <w:tcW w:type="dxa" w:w="5400"/>
           </w:tcPr>
           <w:p>
             <w:pPr>
               <w:jc w:val="center"/>
             </w:pPr>
             <w:r>
-              <w:t>[LOGO AQUÍ]</w:t>
+              <w:rPr>
+                <w:b/>
+                <w:sz w:val="20"/>
+              </w:rPr>
+              <w:t>Servicio</w:t>
+              <w:br/>
+              <w:t>N°</w:t>
             </w:r>
           </w:p>
         </w:tc>
@@ -30,78 +75,18 @@
           <w:tcPr>
             <w:tcW w:type="dxa" w:w="5400"/>
           </w:tcPr>
-          <w:p/>
-          <w:tbl>
-            <w:tblPr>
-              <w:tblW w:type="auto" w:w="0"/>
-              <w:tblLook w:firstColumn="1" w:firstRow="1" w:lastColumn="0" w:lastRow="0" w:noHBand="0" w:noVBand="1" w:val="04A0"/>
-            </w:tblPr>
-            <w:tblGrid>
-              <w:gridCol w:w="2700"/>
-              <w:gridCol w:w="2700"/>
-            </w:tblGrid>
-            <w:tr>
-              <w:tc>
-                <w:tcPr>
-                  <w:tcW w:type="dxa" w:w="2700"/>
-                </w:tcPr>
-                <w:p>
-                  <w:pPr>
-                    <w:jc w:val="center"/>
-                  </w:pPr>
-                  <w:r>
-                    <w:rPr>
-                      <w:b/>
-                      <w:sz w:val="24"/>
-                    </w:rPr>
-                    <w:t>Servicio</w:t>
-                    <w:br/>
-                    <w:t>N°</w:t>
-                  </w:r>
-                </w:p>
-              </w:tc>
-              <w:tc>
-                <w:tcPr>
-                  <w:tcW w:type="dxa" w:w="2700"/>
-                </w:tcPr>
-                <w:p>
-                  <w:pPr>
-                    <w:jc w:val="center"/>
-                  </w:pPr>
-                  <w:r>
-                    <w:rPr>
-                      <w:b/>
-                      <w:sz w:val="24"/>
-                    </w:rPr>
-                    <w:t>&lt;&lt;OT&gt;&gt;</w:t>
-                  </w:r>
-                </w:p>
-              </w:tc>
-            </w:tr>
-            <w:tr>
-              <w:tc>
-                <w:tcPr>
-                  <w:tcW w:type="dxa" w:w="2700"/>
-                </w:tcPr>
-                <w:p>
-                  <w:pPr>
-                    <w:jc w:val="center"/>
-                  </w:pPr>
-                </w:p>
-              </w:tc>
-              <w:tc>
-                <w:tcPr>
-                  <w:tcW w:type="dxa" w:w="2700"/>
-                </w:tcPr>
-                <w:p>
-                  <w:pPr>
-                    <w:jc w:val="center"/>
-                  </w:pPr>
-                </w:p>
-              </w:tc>
-            </w:tr>
-          </w:tbl>
-          <w:p/>
+          <w:p>
+            <w:pPr>
+              <w:jc w:val="center"/>
+            </w:pPr>
+            <w:r>
+              <w:rPr>
+                <w:b/>
+                <w:sz w:val="24"/>
+              </w:rPr>
+              <w:t>&lt;&lt;OT&gt;&gt;</w:t>
+            </w:r>
+          </w:p>
         </w:tc>
       </w:tr>
     </w:tbl>
@@ -491,7 +476,7 @@
     </w:tbl>
     <w:sectPr>
       <w:pgSz w:w="12240" w:h="15840"/>
-      <w:pgMar w:top="720" w:right="720" w:bottom="720" w:left="720" w:header="720" w:footer="720" w:gutter="0"/>
+      <w:pgMar w:top="432" w:right="720" w:bottom="720" w:left="720" w:header="720" w:footer="720" w:gutter="0"/>
       <w:cols w:space="720"/>
       <w:docGrid w:linePitch="360"/>
     </w:sectPr>

</xml_diff>